<commit_message>
1 Euro Auctions v2: versione definitiva dello studio del 13/10 riportata nell'IT e nelle 10 lingue (12 paragrafi), verifiche OK, report
Co-Authored-By: Claude Opus 5.5 <noreply@anthropic.com>
Claude-Session: https://claude.ai/code/session_01Fft5ex4c8NSfwonzhN2ZEF
</commit_message>
<xml_diff>
--- a/T&C/1 Euro Auctions/Vers 2 - Multilanguage - Q4 2026/2_CPA_1EuroAuction_Versione_2_2026_DEF_CECO.docx
+++ b/T&C/1 Euro Auctions/Vers 2 - Multilanguage - Q4 2026/2_CPA_1EuroAuction_Versione_2_2026_DEF_CECO.docx
@@ -94,10 +94,8 @@
           <w:sz w:val="20"/>
           <w:szCs w:val="20"/>
         </w:rPr>
-        <w:t>Tyto Zvláštní aukční podmínky upravují kategorii aukcí označovanou jako „1 Euro Auctions“, organizovaných společností Fleequid v rámci Marketplace jako zvláštní, specifický a odchylný způsob prodeje vozidel.</w:t>
-      </w:r>
-      <w:proofErr w:type="spellStart"/>
-      <w:proofErr w:type="spellEnd"/>
+        <w:t>Tyto Zvláštní prodejní podmínky upravují kategorii aukcí označovanou jako „1 Euro Auctions“, organizovaných společností Fleequid v rámci Marketplace jako zvláštní, specifický a odchylný způsob prodeje vozidel.</w:t>
+      </w:r>
     </w:p>
     <w:p>
       <w:pPr>
@@ -117,7 +115,7 @@
           <w:sz w:val="20"/>
           <w:szCs w:val="20"/>
         </w:rPr>
-        <w:t>Jsou přijaty ve smyslu a s účinky čl. 4.3, 4.4 a 9.4 písm. d) Všeobecných obchodních podmínek Marketplace Fleequid („VOP“) a představují Zvláštní prodejní podmínky ve smyslu VOP (dále také „Zvláštní aukční podmínky“), s následnou předností před VOP v případě neslučitelnosti a v mezích záležitostí výslovně upravených v tomto dokumentu.</w:t>
+        <w:t>Jsou přijaty ve smyslu a s účinky čl. 4.3, 4.4, 4.5 a 9.4 písm. d) Všeobecných obchodních podmínek Marketplace Fleequid („VOP“) a představují Zvláštní prodejní podmínky ve smyslu VOP (dále také „Zvláštní podmínky“), s následnou předností před VOP v případě neslučitelnosti a v mezích záležitostí výslovně upravených v tomto dokumentu.</w:t>
       </w:r>
     </w:p>
     <w:p>
@@ -138,10 +136,8 @@
           <w:sz w:val="20"/>
           <w:szCs w:val="20"/>
         </w:rPr>
-        <w:t>Tyto Zvláštní podmínky se použijí výhradně tehdy, je-li aukce výslovně kvalifikována jako „1 Euro Auction“ v příslušném formuláři zveřejněném na Marketplace, a to i pouhým označením nebo opatřením štítkem, nezávisle na přítomnosti úplného textového odkazu nebo specifického popisného obsahu. Taková kvalifikace má za následek automatické použití těchto podmínek na příslušný smluvní vztah, na základě registrace a užívání Marketplace ze strany Uživatelů, bez nutnosti dalšího přijetí, přičemž zůstávají v platnosti VOP již schválené Uživateli.</w:t>
-      </w:r>
-      <w:proofErr w:type="spellStart"/>
-      <w:proofErr w:type="spellEnd"/>
+        <w:t>Tyto Zvláštní podmínky se použijí výhradně tehdy, je-li aukce výslovně kvalifikována jako „1 Euro Auction“ v příslušném formuláři zveřejněném na Marketplace, a to i pouhým označením nebo opatřením štítkem, za předpokladu, že je příslušný text zpřístupněn k nahlédnutí před podáním nabídky ve smyslu čl. 4.5 VOP.</w:t>
+      </w:r>
     </w:p>
     <w:p>
       <w:pPr>
@@ -161,7 +157,7 @@
           <w:sz w:val="20"/>
           <w:szCs w:val="20"/>
         </w:rPr>
-        <w:t>Zveřejnění návrhu prodeje v rámci aukce kvalifikované jako „1 Euro Auction“, jakož i účast na ní ze strany nabízejících, představuje výslovné, úplné a závazné přijetí těchto Zvláštních podmínek. Zůstává nedotčeno zvláštní písemné schválení, ve smyslu čl. 1341 a 1342 italského občanského zákoníku, ustanovení uvedených v závěrečné části tohoto dokumentu.</w:t>
+        <w:t>Zůstává nedotčeno zvláštní písemné schválení, ve smyslu čl. 1341 a 1342 italského občanského zákoníku, ustanovení uvedených v závěrečné části tohoto dokumentu.</w:t>
       </w:r>
     </w:p>
     <w:p>
@@ -182,10 +178,8 @@
           <w:sz w:val="20"/>
           <w:szCs w:val="20"/>
         </w:rPr>
-        <w:t>Pokud jde o záležitosti, které nejsou v tomto dokumentu výslovně upraveny, zůstávají plně použitelné VOP, případné specifické podmínky a Ceník Fleequid, pokud jsou slučitelné s povahou „1 Euro Auctions“, podle hierarchie stanovené čl. 3.3 VOP.</w:t>
-      </w:r>
-      <w:proofErr w:type="spellStart"/>
-      <w:proofErr w:type="spellEnd"/>
+        <w:t>Pokud jde o záležitosti, které nejsou v tomto dokumentu výslovně upraveny, zůstávají plně použitelné VOP, případné Specifické podmínky a Ceník Fleequid, podle hierarchie stanovené čl. 4.3 VOP.</w:t>
+      </w:r>
     </w:p>
     <w:p>
       <w:pPr>
@@ -277,7 +271,7 @@
           <w:sz w:val="20"/>
           <w:szCs w:val="20"/>
         </w:rPr>
-        <w:t>„1 Euro Auctions“ představují zvláštní kategorii aukce organizované společností Fleequid v rámci Marketplace, vyznačující se specifickým způsobem stanovení ceny a specifickými ekonomickými podmínkami oproti běžným aukcím upraveným Všeobecnými obchodními podmínkami („VOP“).</w:t>
+        <w:t>„1 Euro Auctions“ představují zvláštní kategorii aukce organizované společností Fleequid v rámci Marketplace, vyznačující se specifickým způsobem stanovení ceny a specifickými ekonomickými podmínkami, odlišnými od podmínek běžných aukcí upravených Všeobecnými obchodními podmínkami („VOP“).</w:t>
       </w:r>
     </w:p>
     <w:p>
@@ -528,7 +522,7 @@
           <w:sz w:val="20"/>
           <w:szCs w:val="20"/>
         </w:rPr>
-        <w:t>Pokud na konci 1 Euro Auction nedojde k žádné platné nabídce, považuje se aukce za neúspěšnou a nebude uzavřena žádná Závazná dohoda ve smyslu VOP; v důsledku toho nevznikne společnosti Fleequid, prodávajícímu ani třetím osobám žádná povinnost koupě vozidla.</w:t>
+        <w:t>Pokud na konci 1 Euro Auction nedojde k žádné platné nabídce, považuje se aukce za neúspěšnou a nebude uzavřena žádná Závazná dohoda ve smyslu VOP.</w:t>
       </w:r>
     </w:p>
     <w:p>
@@ -727,7 +721,7 @@
           <w:sz w:val="20"/>
           <w:szCs w:val="20"/>
         </w:rPr>
-        <w:t>Úhrada případného ekonomického doplnění až do výše MZPC je podmíněna řádným uzavřením smlouvy a úplným a definitivním splněním platebních povinností ze strany kupujícího, podle toho, co je stanoveno VOP. Rovněž se rozumí, že prodávající musí úplně a bez výhrad splnit všechny povinnosti stanovené VOP a těmito Zvláštními podmínkami, včetně, příkladmo, povinností týkajících se shody vozidla, úplnosti a pravdivosti poskytnutých informací a řádného provedení dodání.</w:t>
+        <w:t>Úhrada případného ekonomického doplnění až do výše MZPC je podmíněna řádným uzavřením Závazné dohody a úplným a definitivním splněním platebních povinností ze strany kupujícího, podle toho, co je stanoveno VOP. Rovněž se rozumí, že prodávající musí úplně a bez výhrad splnit všechny povinnosti stanovené VOP a těmito Zvláštními podmínkami, včetně, příkladmo, povinností týkajících se shody vozidla, úplnosti a pravdivosti poskytnutých informací a řádného provedení dodání.</w:t>
       </w:r>
     </w:p>
     <w:p>
@@ -849,7 +843,7 @@
           <w:sz w:val="20"/>
           <w:szCs w:val="20"/>
         </w:rPr>
-        <w:t>Struktura provizí.</w:t>
+        <w:t>Struktura provizí v rámci Komisního prodeje.</w:t>
       </w:r>
     </w:p>
     <w:p>
@@ -1096,10 +1090,8 @@
           <w:sz w:val="20"/>
           <w:szCs w:val="20"/>
         </w:rPr>
-        <w:t>Kupující, jemuž bylo přiklepnuto, je povinen uhradit příklepovou cenu a dlužné provize ve lhůtách a způsoby předvídanými VOP, jakož i Ceníkem použitelným na konkrétní 1 Euro Auction.</w:t>
-      </w:r>
-      <w:proofErr w:type="spellStart"/>
-      <w:proofErr w:type="spellEnd"/>
+        <w:t>Kupující je povinen uhradit Celkovou dlužnou částku ve lhůtách a způsoby předvídanými VOP a podmínkami použitelnými na konkrétní 1 Euro Auction.</w:t>
+      </w:r>
     </w:p>
     <w:p>
       <w:pPr>
@@ -1148,10 +1140,8 @@
           <w:sz w:val="20"/>
           <w:szCs w:val="20"/>
         </w:rPr>
-        <w:t>V případě 1 Euro Auctions je případné ekonomické doplnění ve prospěch prodávajícího dlužné společností Fleequid výhradně v mezích a za podmínek předvídaných čl. 3 těchto Zvláštních podmínek. Rozumí se, že takové doplnění je podmíněno úplným splněním podmínek tam stanovených, včetně řádného uzavření smlouvy a skutečného přijetí částek dlužných kupujícím, není-li v těchto Zvláštních podmínkách stanoveno jinak.</w:t>
-      </w:r>
-      <w:proofErr w:type="spellStart"/>
-      <w:proofErr w:type="spellEnd"/>
+        <w:t>V případě 1 Euro Auctions je případné ekonomické doplnění ve prospěch prodávajícího dlužné společností Fleequid výhradně v mezích a za podmínek předvídaných čl. 3 těchto Zvláštních podmínek. Rozumí se, že takové doplnění je podmíněno úplným splněním podmínek tam stanovených, včetně řádného uzavření Závazné dohody a skutečného přijetí částek dlužných kupujícím, není-li v těchto Zvláštních podmínkách stanoveno jinak.</w:t>
+      </w:r>
     </w:p>
     <w:p>
       <w:pPr>
@@ -1467,6 +1457,7 @@
         <w:rPr>
           <w:rFonts w:ascii="Verdana" w:hAnsi="Verdana"/>
           <w:b/>
+          <w:bCs/>
           <w:sz w:val="20"/>
           <w:szCs w:val="20"/>
         </w:rPr>
@@ -1497,6 +1488,7 @@
         <w:rPr>
           <w:rFonts w:ascii="Verdana" w:hAnsi="Verdana"/>
           <w:b/>
+          <w:bCs/>
           <w:sz w:val="20"/>
           <w:szCs w:val="20"/>
         </w:rPr>

</xml_diff>